<commit_message>
complete quiz 2 advance
</commit_message>
<xml_diff>
--- a/week2/AI_support/quiz2.docx
+++ b/week2/AI_support/quiz2.docx
@@ -31,7 +31,6 @@
       <w:pPr>
         <w:jc w:val="center"/>
         <w:rPr>
-          <w:rFonts w:hint="eastAsia"/>
           <w:b/>
           <w:bCs/>
         </w:rPr>
@@ -40,6 +39,7 @@
         <w:rPr>
           <w:b/>
           <w:bCs/>
+          <w:noProof/>
         </w:rPr>
         <w:drawing>
           <wp:inline distT="0" distB="0" distL="0" distR="0" wp14:anchorId="17756408" wp14:editId="7D9EE063">
@@ -81,6 +81,7 @@
         <w:rPr>
           <w:b/>
           <w:bCs/>
+          <w:noProof/>
         </w:rPr>
         <w:drawing>
           <wp:inline distT="0" distB="0" distL="0" distR="0" wp14:anchorId="1AA396D7" wp14:editId="5E8FA896">
@@ -122,6 +123,7 @@
         <w:rPr>
           <w:b/>
           <w:bCs/>
+          <w:noProof/>
         </w:rPr>
         <w:drawing>
           <wp:inline distT="0" distB="0" distL="0" distR="0" wp14:anchorId="10E434C5" wp14:editId="7B5DA056">
@@ -163,6 +165,7 @@
         <w:rPr>
           <w:b/>
           <w:bCs/>
+          <w:noProof/>
         </w:rPr>
         <w:lastRenderedPageBreak/>
         <w:drawing>
@@ -205,6 +208,7 @@
         <w:rPr>
           <w:b/>
           <w:bCs/>
+          <w:noProof/>
         </w:rPr>
         <w:drawing>
           <wp:inline distT="0" distB="0" distL="0" distR="0" wp14:anchorId="57123005" wp14:editId="0D2D3486">
@@ -246,6 +250,7 @@
         <w:rPr>
           <w:b/>
           <w:bCs/>
+          <w:noProof/>
         </w:rPr>
         <w:drawing>
           <wp:inline distT="0" distB="0" distL="0" distR="0" wp14:anchorId="038FCC48" wp14:editId="4105DB05">
@@ -287,6 +292,7 @@
         <w:rPr>
           <w:b/>
           <w:bCs/>
+          <w:noProof/>
         </w:rPr>
         <w:drawing>
           <wp:inline distT="0" distB="0" distL="0" distR="0" wp14:anchorId="7295AEAA" wp14:editId="69B1A166">
@@ -313,6 +319,181 @@
                     <a:xfrm>
                       <a:off x="0" y="0"/>
                       <a:ext cx="4320000" cy="698502"/>
+                    </a:xfrm>
+                    <a:prstGeom prst="rect">
+                      <a:avLst/>
+                    </a:prstGeom>
+                  </pic:spPr>
+                </pic:pic>
+              </a:graphicData>
+            </a:graphic>
+          </wp:inline>
+        </w:drawing>
+      </w:r>
+    </w:p>
+    <w:p>
+      <w:pPr>
+        <w:widowControl/>
+        <w:rPr>
+          <w:b/>
+          <w:bCs/>
+        </w:rPr>
+      </w:pPr>
+      <w:r>
+        <w:rPr>
+          <w:b/>
+          <w:bCs/>
+        </w:rPr>
+        <w:br w:type="page"/>
+      </w:r>
+    </w:p>
+    <w:p>
+      <w:pPr>
+        <w:jc w:val="center"/>
+        <w:rPr>
+          <w:b/>
+          <w:bCs/>
+        </w:rPr>
+      </w:pPr>
+      <w:r>
+        <w:rPr>
+          <w:rFonts w:hint="eastAsia"/>
+          <w:b/>
+          <w:bCs/>
+        </w:rPr>
+        <w:lastRenderedPageBreak/>
+        <w:t xml:space="preserve">QUIZ 2 </w:t>
+      </w:r>
+      <w:r>
+        <w:rPr>
+          <w:rFonts w:hint="eastAsia"/>
+          <w:b/>
+          <w:bCs/>
+        </w:rPr>
+        <w:t>進階</w:t>
+      </w:r>
+    </w:p>
+    <w:p>
+      <w:pPr>
+        <w:jc w:val="center"/>
+        <w:rPr>
+          <w:rFonts w:hint="eastAsia"/>
+          <w:b/>
+          <w:bCs/>
+        </w:rPr>
+      </w:pPr>
+      <w:r>
+        <w:rPr>
+          <w:b/>
+          <w:bCs/>
+        </w:rPr>
+        <w:drawing>
+          <wp:inline distT="0" distB="0" distL="0" distR="0" wp14:anchorId="15D4B24F" wp14:editId="04957D66">
+            <wp:extent cx="4320000" cy="2009169"/>
+            <wp:effectExtent l="0" t="0" r="4445" b="0"/>
+            <wp:docPr id="6" name="圖片 6"/>
+            <wp:cNvGraphicFramePr>
+              <a:graphicFrameLocks xmlns:a="http://schemas.openxmlformats.org/drawingml/2006/main" noChangeAspect="1"/>
+            </wp:cNvGraphicFramePr>
+            <a:graphic xmlns:a="http://schemas.openxmlformats.org/drawingml/2006/main">
+              <a:graphicData uri="http://schemas.openxmlformats.org/drawingml/2006/picture">
+                <pic:pic xmlns:pic="http://schemas.openxmlformats.org/drawingml/2006/picture">
+                  <pic:nvPicPr>
+                    <pic:cNvPr id="1" name=""/>
+                    <pic:cNvPicPr/>
+                  </pic:nvPicPr>
+                  <pic:blipFill>
+                    <a:blip r:embed="rId11"/>
+                    <a:stretch>
+                      <a:fillRect/>
+                    </a:stretch>
+                  </pic:blipFill>
+                  <pic:spPr>
+                    <a:xfrm>
+                      <a:off x="0" y="0"/>
+                      <a:ext cx="4320000" cy="2009169"/>
+                    </a:xfrm>
+                    <a:prstGeom prst="rect">
+                      <a:avLst/>
+                    </a:prstGeom>
+                  </pic:spPr>
+                </pic:pic>
+              </a:graphicData>
+            </a:graphic>
+          </wp:inline>
+        </w:drawing>
+      </w:r>
+      <w:r>
+        <w:rPr>
+          <w:b/>
+          <w:bCs/>
+        </w:rPr>
+        <w:drawing>
+          <wp:inline distT="0" distB="0" distL="0" distR="0" wp14:anchorId="68F23A1A" wp14:editId="6FEC031C">
+            <wp:extent cx="4320000" cy="2450739"/>
+            <wp:effectExtent l="0" t="0" r="4445" b="6985"/>
+            <wp:docPr id="7" name="圖片 7"/>
+            <wp:cNvGraphicFramePr>
+              <a:graphicFrameLocks xmlns:a="http://schemas.openxmlformats.org/drawingml/2006/main" noChangeAspect="1"/>
+            </wp:cNvGraphicFramePr>
+            <a:graphic xmlns:a="http://schemas.openxmlformats.org/drawingml/2006/main">
+              <a:graphicData uri="http://schemas.openxmlformats.org/drawingml/2006/picture">
+                <pic:pic xmlns:pic="http://schemas.openxmlformats.org/drawingml/2006/picture">
+                  <pic:nvPicPr>
+                    <pic:cNvPr id="1" name=""/>
+                    <pic:cNvPicPr/>
+                  </pic:nvPicPr>
+                  <pic:blipFill>
+                    <a:blip r:embed="rId12"/>
+                    <a:stretch>
+                      <a:fillRect/>
+                    </a:stretch>
+                  </pic:blipFill>
+                  <pic:spPr>
+                    <a:xfrm>
+                      <a:off x="0" y="0"/>
+                      <a:ext cx="4320000" cy="2450739"/>
+                    </a:xfrm>
+                    <a:prstGeom prst="rect">
+                      <a:avLst/>
+                    </a:prstGeom>
+                  </pic:spPr>
+                </pic:pic>
+              </a:graphicData>
+            </a:graphic>
+          </wp:inline>
+        </w:drawing>
+      </w:r>
+      <w:r>
+        <w:rPr>
+          <w:b/>
+          <w:bCs/>
+        </w:rPr>
+        <w:drawing>
+          <wp:inline distT="0" distB="0" distL="0" distR="0" wp14:anchorId="7EB4E19F" wp14:editId="0E98D1ED">
+            <wp:extent cx="4320000" cy="2679066"/>
+            <wp:effectExtent l="0" t="0" r="4445" b="6985"/>
+            <wp:docPr id="10" name="圖片 10"/>
+            <wp:cNvGraphicFramePr>
+              <a:graphicFrameLocks xmlns:a="http://schemas.openxmlformats.org/drawingml/2006/main" noChangeAspect="1"/>
+            </wp:cNvGraphicFramePr>
+            <a:graphic xmlns:a="http://schemas.openxmlformats.org/drawingml/2006/main">
+              <a:graphicData uri="http://schemas.openxmlformats.org/drawingml/2006/picture">
+                <pic:pic xmlns:pic="http://schemas.openxmlformats.org/drawingml/2006/picture">
+                  <pic:nvPicPr>
+                    <pic:cNvPr id="1" name=""/>
+                    <pic:cNvPicPr/>
+                  </pic:nvPicPr>
+                  <pic:blipFill>
+                    <a:blip r:embed="rId13"/>
+                    <a:stretch>
+                      <a:fillRect/>
+                    </a:stretch>
+                  </pic:blipFill>
+                  <pic:spPr>
+                    <a:xfrm>
+                      <a:off x="0" y="0"/>
+                      <a:ext cx="4320000" cy="2679066"/>
                     </a:xfrm>
                     <a:prstGeom prst="rect">
                       <a:avLst/>

</xml_diff>